<commit_message>
docs: corrige autoevaluacion fase 1 de Miguel Ortega
El error se originó por utilizar el mismo molde del documento anterior.
</commit_message>
<xml_diff>
--- a/Fase 1/Evidencias Individuales/Ortega_Miguel_1.3_APT122_AutoevaluacionFase1.docx
+++ b/Fase 1/Evidencias Individuales/Ortega_Miguel_1.3_APT122_AutoevaluacionFase1.docx
@@ -15,6 +15,19 @@
           <w:lang w:val="es-CL" w:eastAsia="es-CL"/>
         </w:rPr>
       </w:pPr>
+      <w:r>
+        <w:rPr>
+          <w:rFonts w:asciiTheme="minorHAnsi" w:eastAsiaTheme="minorEastAsia" w:hAnsiTheme="minorHAnsi" w:cstheme="minorBidi"/>
+          <w:b/>
+          <w:bCs/>
+          <w:color w:val="000000"/>
+          <w:spacing w:val="-30"/>
+          <w:sz w:val="72"/>
+          <w:szCs w:val="72"/>
+          <w:lang w:val="es-CL" w:eastAsia="es-CL"/>
+        </w:rPr>
+        <w:t xml:space="preserve">   </w:t>
+      </w:r>
       <w:r>
         <w:rPr>
           <w:rFonts w:asciiTheme="minorHAnsi" w:eastAsiaTheme="minorEastAsia" w:hAnsiTheme="minorHAnsi" w:cstheme="minorBidi"/>
@@ -334,7 +347,6 @@
               <w:spacing w:before="120" w:after="120"/>
               <w:jc w:val="center"/>
             </w:pPr>
-            <w:proofErr w:type="spellStart"/>
             <w:r>
               <w:rPr>
                 <w:rFonts w:asciiTheme="minorHAnsi" w:eastAsiaTheme="minorEastAsia" w:hAnsiTheme="minorHAnsi" w:cstheme="minorBidi"/>
@@ -347,7 +359,6 @@
               </w:rPr>
               <w:t>Capstone</w:t>
             </w:r>
-            <w:proofErr w:type="spellEnd"/>
           </w:p>
         </w:tc>
         <w:tc>
@@ -1892,32 +1903,14 @@
                 <w:bCs/>
                 <w:color w:val="3B3838" w:themeColor="background2" w:themeShade="40"/>
               </w:rPr>
-              <w:t xml:space="preserve">IL </w:t>
-            </w:r>
-            <w:proofErr w:type="gramStart"/>
-            <w:r>
-              <w:rPr>
-                <w:rFonts w:asciiTheme="minorHAnsi" w:eastAsiaTheme="minorEastAsia" w:hAnsiTheme="minorHAnsi" w:cstheme="minorBidi"/>
-                <w:b/>
-                <w:bCs/>
+              <w:t xml:space="preserve">IL 1.3  </w:t>
+            </w:r>
+            <w:r>
+              <w:rPr>
+                <w:rFonts w:asciiTheme="minorHAnsi" w:eastAsiaTheme="minorEastAsia" w:hAnsiTheme="minorHAnsi" w:cstheme="minorBidi"/>
                 <w:color w:val="3B3838" w:themeColor="background2" w:themeShade="40"/>
               </w:rPr>
-              <w:t xml:space="preserve">1.3  </w:t>
-            </w:r>
-            <w:r>
-              <w:rPr>
-                <w:rFonts w:asciiTheme="minorHAnsi" w:eastAsiaTheme="minorEastAsia" w:hAnsiTheme="minorHAnsi" w:cstheme="minorBidi"/>
-                <w:color w:val="3B3838" w:themeColor="background2" w:themeShade="40"/>
-              </w:rPr>
-              <w:t>Establece</w:t>
-            </w:r>
-            <w:proofErr w:type="gramEnd"/>
-            <w:r>
-              <w:rPr>
-                <w:rFonts w:asciiTheme="minorHAnsi" w:eastAsiaTheme="minorEastAsia" w:hAnsiTheme="minorHAnsi" w:cstheme="minorBidi"/>
-                <w:color w:val="3B3838" w:themeColor="background2" w:themeShade="40"/>
-              </w:rPr>
-              <w:t xml:space="preserve"> un plan de trabajo para su Proyecto APT y evidencias que permiten cumplir los objetivos propuestos, considerando recursos y tiempos pertinentes para el desarrollo de las actividades en el periodo académico establecido.</w:t>
+              <w:t>Establece un plan de trabajo para su Proyecto APT y evidencias que permiten cumplir los objetivos propuestos, considerando recursos y tiempos pertinentes para el desarrollo de las actividades en el periodo académico establecido.</w:t>
             </w:r>
           </w:p>
         </w:tc>
@@ -2483,23 +2476,7 @@
                 <w:rFonts w:asciiTheme="minorHAnsi" w:eastAsiaTheme="minorEastAsia" w:hAnsiTheme="minorHAnsi" w:cstheme="minorBidi"/>
                 <w:color w:val="3B3838" w:themeColor="background2" w:themeShade="40"/>
               </w:rPr>
-              <w:t xml:space="preserve">el diseño del Proyecto APT </w:t>
-            </w:r>
-            <w:proofErr w:type="gramStart"/>
-            <w:r>
-              <w:rPr>
-                <w:rFonts w:asciiTheme="minorHAnsi" w:eastAsiaTheme="minorEastAsia" w:hAnsiTheme="minorHAnsi" w:cstheme="minorBidi"/>
-                <w:color w:val="3B3838" w:themeColor="background2" w:themeShade="40"/>
-              </w:rPr>
-              <w:t>de acuerdo a</w:t>
-            </w:r>
-            <w:proofErr w:type="gramEnd"/>
-            <w:r>
-              <w:rPr>
-                <w:rFonts w:asciiTheme="minorHAnsi" w:eastAsiaTheme="minorEastAsia" w:hAnsiTheme="minorHAnsi" w:cstheme="minorBidi"/>
-                <w:color w:val="3B3838" w:themeColor="background2" w:themeShade="40"/>
-              </w:rPr>
-              <w:t xml:space="preserve"> estándares definidos por la disciplina.</w:t>
+              <w:t>el diseño del Proyecto APT de acuerdo a estándares definidos por la disciplina.</w:t>
             </w:r>
           </w:p>
         </w:tc>
@@ -2523,25 +2500,7 @@
                 <w:color w:val="000000" w:themeColor="text1"/>
                 <w:lang w:eastAsia="es-CL"/>
               </w:rPr>
-              <w:t xml:space="preserve">11. Cumple con los indicadores de calidad requeridos en la presentación del diseño del Proyecto APT </w:t>
-            </w:r>
-            <w:proofErr w:type="gramStart"/>
-            <w:r>
-              <w:rPr>
-                <w:rFonts w:asciiTheme="minorHAnsi" w:eastAsiaTheme="minorEastAsia" w:hAnsiTheme="minorHAnsi" w:cstheme="minorBidi"/>
-                <w:color w:val="000000" w:themeColor="text1"/>
-                <w:lang w:eastAsia="es-CL"/>
-              </w:rPr>
-              <w:t>de acuerdo a</w:t>
-            </w:r>
-            <w:proofErr w:type="gramEnd"/>
-            <w:r>
-              <w:rPr>
-                <w:rFonts w:asciiTheme="minorHAnsi" w:eastAsiaTheme="minorEastAsia" w:hAnsiTheme="minorHAnsi" w:cstheme="minorBidi"/>
-                <w:color w:val="000000" w:themeColor="text1"/>
-                <w:lang w:eastAsia="es-CL"/>
-              </w:rPr>
-              <w:t xml:space="preserve"> estándares definidos por la disciplina.</w:t>
+              <w:t>11. Cumple con los indicadores de calidad requeridos en la presentación del diseño del Proyecto APT de acuerdo a estándares definidos por la disciplina.</w:t>
             </w:r>
           </w:p>
         </w:tc>
@@ -2649,27 +2608,7 @@
                 <w:color w:val="000000" w:themeColor="text1"/>
                 <w:lang w:eastAsia="es-CL"/>
               </w:rPr>
-              <w:t xml:space="preserve">Redacta el </w:t>
-            </w:r>
-            <w:proofErr w:type="spellStart"/>
-            <w:proofErr w:type="gramStart"/>
-            <w:r>
-              <w:rPr>
-                <w:rFonts w:asciiTheme="minorHAnsi" w:eastAsiaTheme="minorEastAsia" w:hAnsiTheme="minorHAnsi" w:cstheme="minorBidi"/>
-                <w:color w:val="000000" w:themeColor="text1"/>
-                <w:lang w:eastAsia="es-CL"/>
-              </w:rPr>
-              <w:t>abstract</w:t>
-            </w:r>
-            <w:proofErr w:type="spellEnd"/>
-            <w:proofErr w:type="gramEnd"/>
-            <w:r>
-              <w:rPr>
-                <w:rFonts w:asciiTheme="minorHAnsi" w:eastAsiaTheme="minorEastAsia" w:hAnsiTheme="minorHAnsi" w:cstheme="minorBidi"/>
-                <w:color w:val="000000" w:themeColor="text1"/>
-                <w:lang w:eastAsia="es-CL"/>
-              </w:rPr>
-              <w:t>, las conclusiones y la reflexión en inglés con ideas completas que se conectan en secuencia lógica, utilizando estructuras gramaticales y vocabulario en forma correcta y pertinente al tema a un nivel intermedio alto.</w:t>
+              <w:t>Redacta el abstract, las conclusiones y la reflexión en inglés con ideas completas que se conectan en secuencia lógica, utilizando estructuras gramaticales y vocabulario en forma correcta y pertinente al tema a un nivel intermedio alto.</w:t>
             </w:r>
           </w:p>
         </w:tc>
@@ -3365,7 +3304,6 @@
                 <w:lang w:val="es-ES"/>
               </w:rPr>
             </w:pPr>
-            <w:proofErr w:type="spellStart"/>
             <w:r>
               <w:rPr>
                 <w:rStyle w:val="normaltextrun"/>
@@ -3375,19 +3313,7 @@
                 <w:szCs w:val="22"/>
                 <w:lang w:val="es-CL"/>
               </w:rPr>
-              <w:t>Abstract</w:t>
-            </w:r>
-            <w:proofErr w:type="spellEnd"/>
-            <w:r>
-              <w:rPr>
-                <w:rStyle w:val="normaltextrun"/>
-                <w:rFonts w:ascii="Calibri" w:eastAsia="Calibri" w:hAnsi="Calibri" w:cs="Calibri"/>
-                <w:color w:val="000000" w:themeColor="text1"/>
-                <w:sz w:val="22"/>
-                <w:szCs w:val="22"/>
-                <w:lang w:val="es-CL"/>
-              </w:rPr>
-              <w:t xml:space="preserve"> (inglés y español) </w:t>
+              <w:t>Abstract (inglés y español) </w:t>
             </w:r>
           </w:p>
           <w:p>
@@ -4193,25 +4119,7 @@
                 <w:sz w:val="22"/>
                 <w:szCs w:val="22"/>
               </w:rPr>
-              <w:t xml:space="preserve"> diseño del Proyecto APT </w:t>
-            </w:r>
-            <w:proofErr w:type="gramStart"/>
-            <w:r>
-              <w:rPr>
-                <w:rFonts w:asciiTheme="minorHAnsi" w:eastAsiaTheme="minorEastAsia" w:hAnsiTheme="minorHAnsi" w:cstheme="minorBidi"/>
-                <w:sz w:val="22"/>
-                <w:szCs w:val="22"/>
-              </w:rPr>
-              <w:t>de acuerdo a</w:t>
-            </w:r>
-            <w:proofErr w:type="gramEnd"/>
-            <w:r>
-              <w:rPr>
-                <w:rFonts w:asciiTheme="minorHAnsi" w:eastAsiaTheme="minorEastAsia" w:hAnsiTheme="minorHAnsi" w:cstheme="minorBidi"/>
-                <w:sz w:val="22"/>
-                <w:szCs w:val="22"/>
-              </w:rPr>
-              <w:t xml:space="preserve"> estándares definidos por la disciplina”, deberás revisar si tu Definición de Proyecto APT cumple con los indicadores de calidad disciplinarios, propios de las competencias del Perfil de Egreso de la Carrera que están involucradas en tu Proyecto. Para ello, deberás seleccionar de la siguiente tabla aquellos indicadores de calidad propios de cada una de las competencias del perfil de egreso que </w:t>
+              <w:t xml:space="preserve"> diseño del Proyecto APT de acuerdo a estándares definidos por la disciplina”, deberás revisar si tu Definición de Proyecto APT cumple con los indicadores de calidad disciplinarios, propios de las competencias del Perfil de Egreso de la Carrera que están involucradas en tu Proyecto. Para ello, deberás seleccionar de la siguiente tabla aquellos indicadores de calidad propios de cada una de las competencias del perfil de egreso que </w:t>
             </w:r>
             <w:r>
               <w:rPr>
@@ -4540,23 +4448,7 @@
                 <w:rFonts w:asciiTheme="minorHAnsi" w:eastAsiaTheme="minorEastAsia" w:hAnsiTheme="minorHAnsi" w:cstheme="minorBidi"/>
                 <w:color w:val="000000" w:themeColor="text1"/>
               </w:rPr>
-              <w:t xml:space="preserve">1.3 Desarrolla mejoras al producto en base al resultado de </w:t>
-            </w:r>
-            <w:proofErr w:type="gramStart"/>
-            <w:r>
-              <w:rPr>
-                <w:rFonts w:asciiTheme="minorHAnsi" w:eastAsiaTheme="minorEastAsia" w:hAnsiTheme="minorHAnsi" w:cstheme="minorBidi"/>
-                <w:color w:val="000000" w:themeColor="text1"/>
-              </w:rPr>
-              <w:t>las mismas</w:t>
-            </w:r>
-            <w:proofErr w:type="gramEnd"/>
-            <w:r>
-              <w:rPr>
-                <w:rFonts w:asciiTheme="minorHAnsi" w:eastAsiaTheme="minorEastAsia" w:hAnsiTheme="minorHAnsi" w:cstheme="minorBidi"/>
-                <w:color w:val="000000" w:themeColor="text1"/>
-              </w:rPr>
-              <w:t xml:space="preserve">. </w:t>
+              <w:t xml:space="preserve">1.3 Desarrolla mejoras al producto en base al resultado de las mismas. </w:t>
             </w:r>
           </w:p>
         </w:tc>
@@ -4597,27 +4489,7 @@
                 <w:bCs/>
                 <w:color w:val="000000" w:themeColor="text1"/>
               </w:rPr>
-              <w:t xml:space="preserve">Gestionar proyectos informáticos, ofreciendo alternativas para la toma de decisiones </w:t>
-            </w:r>
-            <w:proofErr w:type="gramStart"/>
-            <w:r>
-              <w:rPr>
-                <w:rFonts w:asciiTheme="minorHAnsi" w:eastAsiaTheme="minorEastAsia" w:hAnsiTheme="minorHAnsi" w:cstheme="minorBidi"/>
-                <w:b/>
-                <w:bCs/>
-                <w:color w:val="000000" w:themeColor="text1"/>
-              </w:rPr>
-              <w:t>de acuerdo a</w:t>
-            </w:r>
-            <w:proofErr w:type="gramEnd"/>
-            <w:r>
-              <w:rPr>
-                <w:rFonts w:asciiTheme="minorHAnsi" w:eastAsiaTheme="minorEastAsia" w:hAnsiTheme="minorHAnsi" w:cstheme="minorBidi"/>
-                <w:b/>
-                <w:bCs/>
-                <w:color w:val="000000" w:themeColor="text1"/>
-              </w:rPr>
-              <w:t xml:space="preserve"> los requerimientos de la organización.</w:t>
+              <w:t>Gestionar proyectos informáticos, ofreciendo alternativas para la toma de decisiones de acuerdo a los requerimientos de la organización.</w:t>
             </w:r>
           </w:p>
         </w:tc>
@@ -4645,23 +4517,7 @@
                 <w:rFonts w:asciiTheme="minorHAnsi" w:eastAsiaTheme="minorEastAsia" w:hAnsiTheme="minorHAnsi" w:cstheme="minorBidi"/>
                 <w:color w:val="000000" w:themeColor="text1"/>
               </w:rPr>
-              <w:t xml:space="preserve">2.1 Planifica proyectos informáticos, ofreciendo alternativas para la toma de decisiones </w:t>
-            </w:r>
-            <w:proofErr w:type="gramStart"/>
-            <w:r>
-              <w:rPr>
-                <w:rFonts w:asciiTheme="minorHAnsi" w:eastAsiaTheme="minorEastAsia" w:hAnsiTheme="minorHAnsi" w:cstheme="minorBidi"/>
-                <w:color w:val="000000" w:themeColor="text1"/>
-              </w:rPr>
-              <w:t>de acuerdo a</w:t>
-            </w:r>
-            <w:proofErr w:type="gramEnd"/>
-            <w:r>
-              <w:rPr>
-                <w:rFonts w:asciiTheme="minorHAnsi" w:eastAsiaTheme="minorEastAsia" w:hAnsiTheme="minorHAnsi" w:cstheme="minorBidi"/>
-                <w:color w:val="000000" w:themeColor="text1"/>
-              </w:rPr>
-              <w:t xml:space="preserve"> los requerimientos de la organización.</w:t>
+              <w:t>2.1 Planifica proyectos informáticos, ofreciendo alternativas para la toma de decisiones de acuerdo a los requerimientos de la organización.</w:t>
             </w:r>
           </w:p>
         </w:tc>
@@ -4702,23 +4558,7 @@
                 <w:rFonts w:asciiTheme="minorHAnsi" w:eastAsiaTheme="minorEastAsia" w:hAnsiTheme="minorHAnsi" w:cstheme="minorBidi"/>
                 <w:color w:val="000000" w:themeColor="text1"/>
               </w:rPr>
-              <w:t xml:space="preserve">2.2 Controla proyectos informáticos, ofreciendo alternativas para la toma de decisiones </w:t>
-            </w:r>
-            <w:proofErr w:type="gramStart"/>
-            <w:r>
-              <w:rPr>
-                <w:rFonts w:asciiTheme="minorHAnsi" w:eastAsiaTheme="minorEastAsia" w:hAnsiTheme="minorHAnsi" w:cstheme="minorBidi"/>
-                <w:color w:val="000000" w:themeColor="text1"/>
-              </w:rPr>
-              <w:t>de acuerdo a</w:t>
-            </w:r>
-            <w:proofErr w:type="gramEnd"/>
-            <w:r>
-              <w:rPr>
-                <w:rFonts w:asciiTheme="minorHAnsi" w:eastAsiaTheme="minorEastAsia" w:hAnsiTheme="minorHAnsi" w:cstheme="minorBidi"/>
-                <w:color w:val="000000" w:themeColor="text1"/>
-              </w:rPr>
-              <w:t xml:space="preserve"> los requerimientos de la organización.</w:t>
+              <w:t>2.2 Controla proyectos informáticos, ofreciendo alternativas para la toma de decisiones de acuerdo a los requerimientos de la organización.</w:t>
             </w:r>
           </w:p>
         </w:tc>
@@ -4759,27 +4599,7 @@
                 <w:bCs/>
                 <w:color w:val="000000" w:themeColor="text1"/>
               </w:rPr>
-              <w:t xml:space="preserve">Construir modelos de datos para soportar los requerimientos de la organización </w:t>
-            </w:r>
-            <w:proofErr w:type="gramStart"/>
-            <w:r>
-              <w:rPr>
-                <w:rFonts w:asciiTheme="minorHAnsi" w:eastAsiaTheme="minorEastAsia" w:hAnsiTheme="minorHAnsi" w:cstheme="minorBidi"/>
-                <w:b/>
-                <w:bCs/>
-                <w:color w:val="000000" w:themeColor="text1"/>
-              </w:rPr>
-              <w:t>de acuerdo a</w:t>
-            </w:r>
-            <w:proofErr w:type="gramEnd"/>
-            <w:r>
-              <w:rPr>
-                <w:rFonts w:asciiTheme="minorHAnsi" w:eastAsiaTheme="minorEastAsia" w:hAnsiTheme="minorHAnsi" w:cstheme="minorBidi"/>
-                <w:b/>
-                <w:bCs/>
-                <w:color w:val="000000" w:themeColor="text1"/>
-              </w:rPr>
-              <w:t xml:space="preserve"> un diseño definido y escalable en el tiempo.</w:t>
+              <w:t>Construir modelos de datos para soportar los requerimientos de la organización de acuerdo a un diseño definido y escalable en el tiempo.</w:t>
             </w:r>
           </w:p>
         </w:tc>
@@ -4807,23 +4627,7 @@
                 <w:rFonts w:asciiTheme="minorHAnsi" w:eastAsiaTheme="minorEastAsia" w:hAnsiTheme="minorHAnsi" w:cstheme="minorBidi"/>
                 <w:color w:val="000000" w:themeColor="text1"/>
               </w:rPr>
-              <w:t xml:space="preserve">3.1 Diseña modelos de datos para soportar los requerimientos de la organización </w:t>
-            </w:r>
-            <w:proofErr w:type="gramStart"/>
-            <w:r>
-              <w:rPr>
-                <w:rFonts w:asciiTheme="minorHAnsi" w:eastAsiaTheme="minorEastAsia" w:hAnsiTheme="minorHAnsi" w:cstheme="minorBidi"/>
-                <w:color w:val="000000" w:themeColor="text1"/>
-              </w:rPr>
-              <w:t>de acuerdo a</w:t>
-            </w:r>
-            <w:proofErr w:type="gramEnd"/>
-            <w:r>
-              <w:rPr>
-                <w:rFonts w:asciiTheme="minorHAnsi" w:eastAsiaTheme="minorEastAsia" w:hAnsiTheme="minorHAnsi" w:cstheme="minorBidi"/>
-                <w:color w:val="000000" w:themeColor="text1"/>
-              </w:rPr>
-              <w:t xml:space="preserve"> un diseño definido y escalable en el tiempo.</w:t>
+              <w:t>3.1 Diseña modelos de datos para soportar los requerimientos de la organización de acuerdo a un diseño definido y escalable en el tiempo.</w:t>
             </w:r>
           </w:p>
         </w:tc>
@@ -4864,23 +4668,7 @@
                 <w:rFonts w:asciiTheme="minorHAnsi" w:eastAsiaTheme="minorEastAsia" w:hAnsiTheme="minorHAnsi" w:cstheme="minorBidi"/>
                 <w:color w:val="000000" w:themeColor="text1"/>
               </w:rPr>
-              <w:t xml:space="preserve">3.2 Implementa modelos de datos para soportar los requerimientos de la organización </w:t>
-            </w:r>
-            <w:proofErr w:type="gramStart"/>
-            <w:r>
-              <w:rPr>
-                <w:rFonts w:asciiTheme="minorHAnsi" w:eastAsiaTheme="minorEastAsia" w:hAnsiTheme="minorHAnsi" w:cstheme="minorBidi"/>
-                <w:color w:val="000000" w:themeColor="text1"/>
-              </w:rPr>
-              <w:t>de acuerdo a</w:t>
-            </w:r>
-            <w:proofErr w:type="gramEnd"/>
-            <w:r>
-              <w:rPr>
-                <w:rFonts w:asciiTheme="minorHAnsi" w:eastAsiaTheme="minorEastAsia" w:hAnsiTheme="minorHAnsi" w:cstheme="minorBidi"/>
-                <w:color w:val="000000" w:themeColor="text1"/>
-              </w:rPr>
-              <w:t xml:space="preserve"> un diseño definido y escalable en el tiempo.</w:t>
+              <w:t>3.2 Implementa modelos de datos para soportar los requerimientos de la organización de acuerdo a un diseño definido y escalable en el tiempo.</w:t>
             </w:r>
           </w:p>
         </w:tc>
@@ -5740,8 +5528,8 @@
       </w:tblPr>
       <w:tblGrid>
         <w:gridCol w:w="2972"/>
-        <w:gridCol w:w="2268"/>
-        <w:gridCol w:w="2126"/>
+        <w:gridCol w:w="2693"/>
+        <w:gridCol w:w="1701"/>
         <w:gridCol w:w="2127"/>
         <w:gridCol w:w="2052"/>
         <w:gridCol w:w="1449"/>
@@ -5879,7 +5667,7 @@
         </w:tc>
         <w:tc>
           <w:tcPr>
-            <w:tcW w:w="2268" w:type="dxa"/>
+            <w:tcW w:w="2693" w:type="dxa"/>
             <w:shd w:val="clear" w:color="auto" w:fill="262626" w:themeFill="text1" w:themeFillTint="D9"/>
             <w:vAlign w:val="center"/>
             <w:hideMark/>
@@ -5936,7 +5724,7 @@
         </w:tc>
         <w:tc>
           <w:tcPr>
-            <w:tcW w:w="2126" w:type="dxa"/>
+            <w:tcW w:w="1701" w:type="dxa"/>
             <w:shd w:val="clear" w:color="auto" w:fill="262626" w:themeFill="text1" w:themeFillTint="D9"/>
             <w:vAlign w:val="center"/>
             <w:hideMark/>
@@ -6193,7 +5981,7 @@
         </w:tc>
         <w:tc>
           <w:tcPr>
-            <w:tcW w:w="2268" w:type="dxa"/>
+            <w:tcW w:w="2693" w:type="dxa"/>
             <w:shd w:val="clear" w:color="auto" w:fill="E7E6E6"/>
             <w:vAlign w:val="center"/>
           </w:tcPr>
@@ -6245,7 +6033,7 @@
         </w:tc>
         <w:tc>
           <w:tcPr>
-            <w:tcW w:w="2126" w:type="dxa"/>
+            <w:tcW w:w="1701" w:type="dxa"/>
             <w:vAlign w:val="center"/>
           </w:tcPr>
           <w:p>
@@ -6455,13 +6243,14 @@
                 <w:color w:val="000000" w:themeColor="text1"/>
                 <w:lang w:eastAsia="es-CL"/>
               </w:rPr>
+              <w:lastRenderedPageBreak/>
               <w:t>2. Relaciona el Proyecto APT con las competencias del perfil de egreso de su Plan de Estudio.</w:t>
             </w:r>
           </w:p>
         </w:tc>
         <w:tc>
           <w:tcPr>
-            <w:tcW w:w="2268" w:type="dxa"/>
+            <w:tcW w:w="2693" w:type="dxa"/>
             <w:shd w:val="clear" w:color="auto" w:fill="E7E6E6"/>
             <w:vAlign w:val="center"/>
           </w:tcPr>
@@ -6528,15 +6317,7 @@
                 <w:rFonts w:asciiTheme="minorHAnsi" w:eastAsiaTheme="minorEastAsia" w:hAnsiTheme="minorHAnsi" w:cstheme="minorBidi"/>
                 <w:color w:val="000000" w:themeColor="text1"/>
               </w:rPr>
-              <w:t xml:space="preserve"> utilizar </w:t>
-            </w:r>
-            <w:r>
-              <w:rPr>
-                <w:rFonts w:asciiTheme="minorHAnsi" w:eastAsiaTheme="minorEastAsia" w:hAnsiTheme="minorHAnsi" w:cstheme="minorBidi"/>
-                <w:color w:val="000000" w:themeColor="text1"/>
-              </w:rPr>
-              <w:lastRenderedPageBreak/>
-              <w:t xml:space="preserve">distintas competencias para desarrollar </w:t>
+              <w:t xml:space="preserve"> utilizar distintas competencias para desarrollar </w:t>
             </w:r>
             <w:r>
               <w:rPr>
@@ -6556,23 +6337,22 @@
         </w:tc>
         <w:tc>
           <w:tcPr>
-            <w:tcW w:w="2126" w:type="dxa"/>
-            <w:vAlign w:val="center"/>
-          </w:tcPr>
-          <w:p>
-            <w:pPr>
-              <w:rPr>
-                <w:rFonts w:asciiTheme="minorHAnsi" w:eastAsiaTheme="minorEastAsia" w:hAnsiTheme="minorHAnsi" w:cstheme="minorBidi"/>
-                <w:color w:val="000000" w:themeColor="text1"/>
-                <w:lang w:eastAsia="es-CL"/>
-              </w:rPr>
-            </w:pPr>
-            <w:r>
-              <w:rPr>
-                <w:rFonts w:asciiTheme="minorHAnsi" w:eastAsiaTheme="minorEastAsia" w:hAnsiTheme="minorHAnsi" w:cstheme="minorBidi"/>
-                <w:color w:val="000000" w:themeColor="text1"/>
-              </w:rPr>
-              <w:lastRenderedPageBreak/>
+            <w:tcW w:w="1701" w:type="dxa"/>
+            <w:vAlign w:val="center"/>
+          </w:tcPr>
+          <w:p>
+            <w:pPr>
+              <w:rPr>
+                <w:rFonts w:asciiTheme="minorHAnsi" w:eastAsiaTheme="minorEastAsia" w:hAnsiTheme="minorHAnsi" w:cstheme="minorBidi"/>
+                <w:color w:val="000000" w:themeColor="text1"/>
+                <w:lang w:eastAsia="es-CL"/>
+              </w:rPr>
+            </w:pPr>
+            <w:r>
+              <w:rPr>
+                <w:rFonts w:asciiTheme="minorHAnsi" w:eastAsiaTheme="minorEastAsia" w:hAnsiTheme="minorHAnsi" w:cstheme="minorBidi"/>
+                <w:color w:val="000000" w:themeColor="text1"/>
+              </w:rPr>
               <w:t xml:space="preserve">Describí </w:t>
             </w:r>
             <w:r>
@@ -6636,15 +6416,7 @@
                 <w:rFonts w:asciiTheme="minorHAnsi" w:eastAsiaTheme="minorEastAsia" w:hAnsiTheme="minorHAnsi" w:cstheme="minorBidi"/>
                 <w:color w:val="000000" w:themeColor="text1"/>
               </w:rPr>
-              <w:t xml:space="preserve"> </w:t>
-            </w:r>
-            <w:r>
-              <w:rPr>
-                <w:rFonts w:asciiTheme="minorHAnsi" w:eastAsiaTheme="minorEastAsia" w:hAnsiTheme="minorHAnsi" w:cstheme="minorBidi"/>
-                <w:color w:val="000000" w:themeColor="text1"/>
-              </w:rPr>
-              <w:lastRenderedPageBreak/>
-              <w:t xml:space="preserve">utilizar distintas competencias para desarrollar </w:t>
+              <w:t xml:space="preserve"> utilizar distintas competencias para desarrollar </w:t>
             </w:r>
             <w:r>
               <w:rPr>
@@ -6680,7 +6452,6 @@
                 <w:rFonts w:asciiTheme="minorHAnsi" w:eastAsiaTheme="minorEastAsia" w:hAnsiTheme="minorHAnsi" w:cstheme="minorBidi"/>
                 <w:color w:val="000000" w:themeColor="text1"/>
               </w:rPr>
-              <w:lastRenderedPageBreak/>
               <w:t xml:space="preserve">Describí </w:t>
             </w:r>
             <w:r>
@@ -6716,15 +6487,7 @@
                 <w:rFonts w:asciiTheme="minorHAnsi" w:eastAsiaTheme="minorEastAsia" w:hAnsiTheme="minorHAnsi" w:cstheme="minorBidi"/>
                 <w:color w:val="000000" w:themeColor="text1"/>
               </w:rPr>
-              <w:t xml:space="preserve"> proyecto y el perfil de </w:t>
-            </w:r>
-            <w:r>
-              <w:rPr>
-                <w:rFonts w:asciiTheme="minorHAnsi" w:eastAsiaTheme="minorEastAsia" w:hAnsiTheme="minorHAnsi" w:cstheme="minorBidi"/>
-                <w:color w:val="000000" w:themeColor="text1"/>
-              </w:rPr>
-              <w:lastRenderedPageBreak/>
-              <w:t xml:space="preserve">egreso de </w:t>
+              <w:t xml:space="preserve"> proyecto y el perfil de egreso de </w:t>
             </w:r>
             <w:r>
               <w:rPr>
@@ -6760,7 +6523,6 @@
                 <w:rFonts w:asciiTheme="minorHAnsi" w:eastAsiaTheme="minorEastAsia" w:hAnsiTheme="minorHAnsi" w:cstheme="minorBidi"/>
                 <w:color w:val="000000" w:themeColor="text1"/>
               </w:rPr>
-              <w:lastRenderedPageBreak/>
               <w:t xml:space="preserve">Describí </w:t>
             </w:r>
             <w:r>
@@ -6816,7 +6578,6 @@
                 <w:rFonts w:asciiTheme="minorHAnsi" w:eastAsiaTheme="minorEastAsia" w:hAnsiTheme="minorHAnsi" w:cstheme="minorBidi"/>
                 <w:color w:val="000000" w:themeColor="text1"/>
               </w:rPr>
-              <w:lastRenderedPageBreak/>
               <w:t>No relacion</w:t>
             </w:r>
             <w:r>
@@ -6873,7 +6634,6 @@
                 <w:color w:val="3B3838" w:themeColor="background2" w:themeShade="40"/>
                 <w:lang w:eastAsia="es-CL"/>
               </w:rPr>
-              <w:lastRenderedPageBreak/>
               <w:t>5</w:t>
             </w:r>
           </w:p>
@@ -6926,7 +6686,7 @@
         </w:tc>
         <w:tc>
           <w:tcPr>
-            <w:tcW w:w="2268" w:type="dxa"/>
+            <w:tcW w:w="2693" w:type="dxa"/>
             <w:shd w:val="clear" w:color="auto" w:fill="E7E6E6"/>
             <w:vAlign w:val="center"/>
           </w:tcPr>
@@ -6992,7 +6752,7 @@
         </w:tc>
         <w:tc>
           <w:tcPr>
-            <w:tcW w:w="2126" w:type="dxa"/>
+            <w:tcW w:w="1701" w:type="dxa"/>
             <w:vAlign w:val="center"/>
           </w:tcPr>
           <w:p>
@@ -7191,7 +6951,7 @@
         </w:tc>
         <w:tc>
           <w:tcPr>
-            <w:tcW w:w="2268" w:type="dxa"/>
+            <w:tcW w:w="2693" w:type="dxa"/>
             <w:shd w:val="clear" w:color="auto" w:fill="E7E6E6"/>
             <w:vAlign w:val="center"/>
           </w:tcPr>
@@ -7209,7 +6969,7 @@
                 <w:b/>
                 <w:color w:val="000000" w:themeColor="text1"/>
               </w:rPr>
-              <w:t>[X] Justifi</w:t>
+              <w:t>Justifi</w:t>
             </w:r>
             <w:r>
               <w:rPr>
@@ -7243,17 +7003,26 @@
         </w:tc>
         <w:tc>
           <w:tcPr>
-            <w:tcW w:w="2126" w:type="dxa"/>
-            <w:vAlign w:val="center"/>
-          </w:tcPr>
-          <w:p>
-            <w:pPr>
-              <w:rPr>
-                <w:rFonts w:asciiTheme="minorHAnsi" w:eastAsiaTheme="minorEastAsia" w:hAnsiTheme="minorHAnsi" w:cstheme="minorBidi"/>
-                <w:color w:val="000000" w:themeColor="text1"/>
-                <w:lang w:eastAsia="es-CL"/>
-              </w:rPr>
-            </w:pPr>
+            <w:tcW w:w="1701" w:type="dxa"/>
+            <w:vAlign w:val="center"/>
+          </w:tcPr>
+          <w:p>
+            <w:pPr>
+              <w:rPr>
+                <w:rFonts w:asciiTheme="minorHAnsi" w:eastAsiaTheme="minorEastAsia" w:hAnsiTheme="minorHAnsi" w:cstheme="minorBidi"/>
+                <w:color w:val="000000" w:themeColor="text1"/>
+                <w:lang w:eastAsia="es-CL"/>
+              </w:rPr>
+            </w:pPr>
+            <w:r>
+              <w:rPr>
+                <w:rFonts w:asciiTheme="minorHAnsi" w:eastAsiaTheme="minorEastAsia" w:hAnsiTheme="minorHAnsi" w:cstheme="minorBidi"/>
+                <w:b/>
+                <w:color w:val="000000" w:themeColor="text1"/>
+                <w:lang w:eastAsia="es-CL"/>
+              </w:rPr>
+              <w:t xml:space="preserve">[X] </w:t>
+            </w:r>
             <w:r>
               <w:rPr>
                 <w:rFonts w:asciiTheme="minorHAnsi" w:eastAsiaTheme="minorEastAsia" w:hAnsiTheme="minorHAnsi" w:cstheme="minorBidi"/>
@@ -7503,7 +7272,7 @@
         </w:tc>
         <w:tc>
           <w:tcPr>
-            <w:tcW w:w="2268" w:type="dxa"/>
+            <w:tcW w:w="2693" w:type="dxa"/>
             <w:shd w:val="clear" w:color="auto" w:fill="E7E6E6"/>
             <w:vAlign w:val="center"/>
           </w:tcPr>
@@ -7535,28 +7304,37 @@
                 <w:rFonts w:asciiTheme="minorHAnsi" w:eastAsiaTheme="minorEastAsia" w:hAnsiTheme="minorHAnsi" w:cstheme="minorBidi"/>
                 <w:color w:val="000000" w:themeColor="text1"/>
               </w:rPr>
-              <w:t xml:space="preserve"> objetivos claros, concisos y coherentes con la disciplina y la situación a abordar.</w:t>
-            </w:r>
-          </w:p>
-        </w:tc>
-        <w:tc>
-          <w:tcPr>
-            <w:tcW w:w="2126" w:type="dxa"/>
-            <w:vAlign w:val="center"/>
-          </w:tcPr>
-          <w:p>
-            <w:pPr>
-              <w:rPr>
-                <w:rFonts w:asciiTheme="minorHAnsi" w:eastAsiaTheme="minorEastAsia" w:hAnsiTheme="minorHAnsi" w:cstheme="minorBidi"/>
-                <w:color w:val="000000" w:themeColor="text1"/>
-                <w:lang w:eastAsia="es-CL"/>
-              </w:rPr>
-            </w:pPr>
-            <w:r>
-              <w:rPr>
-                <w:rFonts w:asciiTheme="minorHAnsi" w:eastAsiaTheme="minorEastAsia" w:hAnsiTheme="minorHAnsi" w:cstheme="minorBidi"/>
-                <w:color w:val="000000" w:themeColor="text1"/>
-              </w:rPr>
+              <w:t xml:space="preserve"> objetivos claros, concisos y coherentes con la </w:t>
+            </w:r>
+            <w:r>
+              <w:rPr>
+                <w:rFonts w:asciiTheme="minorHAnsi" w:eastAsiaTheme="minorEastAsia" w:hAnsiTheme="minorHAnsi" w:cstheme="minorBidi"/>
+                <w:color w:val="000000" w:themeColor="text1"/>
+              </w:rPr>
+              <w:lastRenderedPageBreak/>
+              <w:t>disciplina y la situación a abordar.</w:t>
+            </w:r>
+          </w:p>
+        </w:tc>
+        <w:tc>
+          <w:tcPr>
+            <w:tcW w:w="1701" w:type="dxa"/>
+            <w:vAlign w:val="center"/>
+          </w:tcPr>
+          <w:p>
+            <w:pPr>
+              <w:rPr>
+                <w:rFonts w:asciiTheme="minorHAnsi" w:eastAsiaTheme="minorEastAsia" w:hAnsiTheme="minorHAnsi" w:cstheme="minorBidi"/>
+                <w:color w:val="000000" w:themeColor="text1"/>
+                <w:lang w:eastAsia="es-CL"/>
+              </w:rPr>
+            </w:pPr>
+            <w:r>
+              <w:rPr>
+                <w:rFonts w:asciiTheme="minorHAnsi" w:eastAsiaTheme="minorEastAsia" w:hAnsiTheme="minorHAnsi" w:cstheme="minorBidi"/>
+                <w:color w:val="000000" w:themeColor="text1"/>
+              </w:rPr>
+              <w:lastRenderedPageBreak/>
               <w:t xml:space="preserve">Formulé </w:t>
             </w:r>
             <w:r>
@@ -7564,23 +7342,15 @@
                 <w:rFonts w:asciiTheme="minorHAnsi" w:eastAsiaTheme="minorEastAsia" w:hAnsiTheme="minorHAnsi" w:cstheme="minorBidi"/>
                 <w:color w:val="000000" w:themeColor="text1"/>
               </w:rPr>
-              <w:t xml:space="preserve">objetivos claros y coherentes con la situación a abordar, pero imprecisos </w:t>
-            </w:r>
-            <w:proofErr w:type="gramStart"/>
-            <w:r>
-              <w:rPr>
-                <w:rFonts w:asciiTheme="minorHAnsi" w:eastAsiaTheme="minorEastAsia" w:hAnsiTheme="minorHAnsi" w:cstheme="minorBidi"/>
-                <w:color w:val="000000" w:themeColor="text1"/>
-              </w:rPr>
-              <w:t>de acuerdo a</w:t>
-            </w:r>
-            <w:proofErr w:type="gramEnd"/>
-            <w:r>
-              <w:rPr>
-                <w:rFonts w:asciiTheme="minorHAnsi" w:eastAsiaTheme="minorEastAsia" w:hAnsiTheme="minorHAnsi" w:cstheme="minorBidi"/>
-                <w:color w:val="000000" w:themeColor="text1"/>
-              </w:rPr>
-              <w:t xml:space="preserve"> la disciplina. </w:t>
+              <w:t xml:space="preserve">objetivos claros y coherentes con la </w:t>
+            </w:r>
+            <w:r>
+              <w:rPr>
+                <w:rFonts w:asciiTheme="minorHAnsi" w:eastAsiaTheme="minorEastAsia" w:hAnsiTheme="minorHAnsi" w:cstheme="minorBidi"/>
+                <w:color w:val="000000" w:themeColor="text1"/>
+              </w:rPr>
+              <w:lastRenderedPageBreak/>
+              <w:t xml:space="preserve">situación a abordar, pero imprecisos de acuerdo a la disciplina. </w:t>
             </w:r>
           </w:p>
         </w:tc>
@@ -7602,6 +7372,7 @@
                 <w:rFonts w:asciiTheme="minorHAnsi" w:eastAsiaTheme="minorEastAsia" w:hAnsiTheme="minorHAnsi" w:cstheme="minorBidi"/>
                 <w:color w:val="000000" w:themeColor="text1"/>
               </w:rPr>
+              <w:lastRenderedPageBreak/>
               <w:t xml:space="preserve">Formulé </w:t>
             </w:r>
             <w:r>
@@ -7609,7 +7380,15 @@
                 <w:rFonts w:asciiTheme="minorHAnsi" w:eastAsiaTheme="minorEastAsia" w:hAnsiTheme="minorHAnsi" w:cstheme="minorBidi"/>
                 <w:color w:val="000000" w:themeColor="text1"/>
               </w:rPr>
-              <w:t xml:space="preserve">objetivos confusos, por lo que no queda claro lo que se busca alcanzar ni si es coherente con la situación a abordar.  </w:t>
+              <w:t xml:space="preserve">objetivos confusos, por lo que no queda claro lo que se </w:t>
+            </w:r>
+            <w:r>
+              <w:rPr>
+                <w:rFonts w:asciiTheme="minorHAnsi" w:eastAsiaTheme="minorEastAsia" w:hAnsiTheme="minorHAnsi" w:cstheme="minorBidi"/>
+                <w:color w:val="000000" w:themeColor="text1"/>
+              </w:rPr>
+              <w:lastRenderedPageBreak/>
+              <w:t xml:space="preserve">busca alcanzar ni si es coherente con la situación a abordar.  </w:t>
             </w:r>
           </w:p>
         </w:tc>
@@ -7631,6 +7410,7 @@
                 <w:rFonts w:asciiTheme="minorHAnsi" w:eastAsiaTheme="minorEastAsia" w:hAnsiTheme="minorHAnsi" w:cstheme="minorBidi"/>
                 <w:color w:val="000000" w:themeColor="text1"/>
               </w:rPr>
+              <w:lastRenderedPageBreak/>
               <w:t>No plante</w:t>
             </w:r>
             <w:r>
@@ -7645,7 +7425,15 @@
                 <w:rFonts w:asciiTheme="minorHAnsi" w:eastAsiaTheme="minorEastAsia" w:hAnsiTheme="minorHAnsi" w:cstheme="minorBidi"/>
                 <w:color w:val="000000" w:themeColor="text1"/>
               </w:rPr>
-              <w:t xml:space="preserve"> objetivos o estos no son coherentes con la disciplina ni la situación a abordar.</w:t>
+              <w:t xml:space="preserve"> objetivos o estos no son coherentes con la </w:t>
+            </w:r>
+            <w:r>
+              <w:rPr>
+                <w:rFonts w:asciiTheme="minorHAnsi" w:eastAsiaTheme="minorEastAsia" w:hAnsiTheme="minorHAnsi" w:cstheme="minorBidi"/>
+                <w:color w:val="000000" w:themeColor="text1"/>
+              </w:rPr>
+              <w:lastRenderedPageBreak/>
+              <w:t>disciplina ni la situación a abordar.</w:t>
             </w:r>
           </w:p>
         </w:tc>
@@ -7673,6 +7461,7 @@
                 <w:color w:val="3B3838" w:themeColor="background2" w:themeShade="40"/>
                 <w:lang w:eastAsia="es-CL"/>
               </w:rPr>
+              <w:lastRenderedPageBreak/>
               <w:t>10</w:t>
             </w:r>
           </w:p>
@@ -7707,7 +7496,7 @@
         </w:tc>
         <w:tc>
           <w:tcPr>
-            <w:tcW w:w="2268" w:type="dxa"/>
+            <w:tcW w:w="2693" w:type="dxa"/>
             <w:shd w:val="clear" w:color="auto" w:fill="E7E6E6"/>
             <w:vAlign w:val="center"/>
           </w:tcPr>
@@ -7745,7 +7534,7 @@
         </w:tc>
         <w:tc>
           <w:tcPr>
-            <w:tcW w:w="2126" w:type="dxa"/>
+            <w:tcW w:w="1701" w:type="dxa"/>
             <w:vAlign w:val="center"/>
           </w:tcPr>
           <w:p>
@@ -7903,16 +7692,7 @@
                 <w:color w:val="000000" w:themeColor="text1"/>
                 <w:lang w:eastAsia="es-CL"/>
               </w:rPr>
-              <w:t xml:space="preserve">7. Establece un plan de trabajo para su proyecto APT </w:t>
-            </w:r>
-            <w:r>
-              <w:rPr>
-                <w:rFonts w:asciiTheme="minorHAnsi" w:eastAsiaTheme="minorEastAsia" w:hAnsiTheme="minorHAnsi" w:cstheme="minorBidi"/>
-                <w:color w:val="000000" w:themeColor="text1"/>
-                <w:lang w:eastAsia="es-CL"/>
-              </w:rPr>
-              <w:lastRenderedPageBreak/>
-              <w:t>considerando los recursos, duración, facilitadores y obstaculizadores en el desarrollo de las actividades</w:t>
+              <w:t>7. Establece un plan de trabajo para su proyecto APT considerando los recursos, duración, facilitadores y obstaculizadores en el desarrollo de las actividades</w:t>
             </w:r>
             <w:r>
               <w:rPr>
@@ -7935,7 +7715,7 @@
         </w:tc>
         <w:tc>
           <w:tcPr>
-            <w:tcW w:w="2268" w:type="dxa"/>
+            <w:tcW w:w="2693" w:type="dxa"/>
             <w:shd w:val="clear" w:color="auto" w:fill="E7E6E6"/>
             <w:vAlign w:val="center"/>
           </w:tcPr>
@@ -7953,7 +7733,6 @@
                 <w:b/>
                 <w:color w:val="000000" w:themeColor="text1"/>
               </w:rPr>
-              <w:lastRenderedPageBreak/>
               <w:t>[X] Establec</w:t>
             </w:r>
             <w:r>
@@ -7968,15 +7747,7 @@
                 <w:rFonts w:asciiTheme="minorHAnsi" w:eastAsiaTheme="minorEastAsia" w:hAnsiTheme="minorHAnsi" w:cstheme="minorBidi"/>
                 <w:color w:val="000000" w:themeColor="text1"/>
               </w:rPr>
-              <w:t xml:space="preserve"> un plan de trabajo con todas las </w:t>
-            </w:r>
-            <w:r>
-              <w:rPr>
-                <w:rFonts w:asciiTheme="minorHAnsi" w:eastAsiaTheme="minorEastAsia" w:hAnsiTheme="minorHAnsi" w:cstheme="minorBidi"/>
-                <w:color w:val="000000" w:themeColor="text1"/>
-              </w:rPr>
-              <w:lastRenderedPageBreak/>
-              <w:t xml:space="preserve">actividades necesarias para cumplir </w:t>
+              <w:t xml:space="preserve"> un plan de trabajo con todas las actividades necesarias para cumplir </w:t>
             </w:r>
             <w:r>
               <w:rPr>
@@ -7996,23 +7767,22 @@
         </w:tc>
         <w:tc>
           <w:tcPr>
-            <w:tcW w:w="2126" w:type="dxa"/>
-            <w:vAlign w:val="center"/>
-          </w:tcPr>
-          <w:p>
-            <w:pPr>
-              <w:rPr>
-                <w:rFonts w:asciiTheme="minorHAnsi" w:eastAsiaTheme="minorEastAsia" w:hAnsiTheme="minorHAnsi" w:cstheme="minorBidi"/>
-                <w:color w:val="000000" w:themeColor="text1"/>
-                <w:lang w:eastAsia="es-CL"/>
-              </w:rPr>
-            </w:pPr>
-            <w:r>
-              <w:rPr>
-                <w:rFonts w:asciiTheme="minorHAnsi" w:eastAsiaTheme="minorEastAsia" w:hAnsiTheme="minorHAnsi" w:cstheme="minorBidi"/>
-                <w:color w:val="000000" w:themeColor="text1"/>
-              </w:rPr>
-              <w:lastRenderedPageBreak/>
+            <w:tcW w:w="1701" w:type="dxa"/>
+            <w:vAlign w:val="center"/>
+          </w:tcPr>
+          <w:p>
+            <w:pPr>
+              <w:rPr>
+                <w:rFonts w:asciiTheme="minorHAnsi" w:eastAsiaTheme="minorEastAsia" w:hAnsiTheme="minorHAnsi" w:cstheme="minorBidi"/>
+                <w:color w:val="000000" w:themeColor="text1"/>
+                <w:lang w:eastAsia="es-CL"/>
+              </w:rPr>
+            </w:pPr>
+            <w:r>
+              <w:rPr>
+                <w:rFonts w:asciiTheme="minorHAnsi" w:eastAsiaTheme="minorEastAsia" w:hAnsiTheme="minorHAnsi" w:cstheme="minorBidi"/>
+                <w:color w:val="000000" w:themeColor="text1"/>
+              </w:rPr>
               <w:t xml:space="preserve">Establecí </w:t>
             </w:r>
             <w:r>
@@ -8020,15 +7790,7 @@
                 <w:rFonts w:asciiTheme="minorHAnsi" w:eastAsiaTheme="minorEastAsia" w:hAnsiTheme="minorHAnsi" w:cstheme="minorBidi"/>
                 <w:color w:val="000000" w:themeColor="text1"/>
               </w:rPr>
-              <w:t xml:space="preserve">un plan de trabajo con la mayoría </w:t>
-            </w:r>
-            <w:r>
-              <w:rPr>
-                <w:rFonts w:asciiTheme="minorHAnsi" w:eastAsiaTheme="minorEastAsia" w:hAnsiTheme="minorHAnsi" w:cstheme="minorBidi"/>
-                <w:color w:val="000000" w:themeColor="text1"/>
-              </w:rPr>
-              <w:lastRenderedPageBreak/>
-              <w:t xml:space="preserve">de las actividades necesarias para cumplir </w:t>
+              <w:t xml:space="preserve">un plan de trabajo con la mayoría de las actividades necesarias para cumplir </w:t>
             </w:r>
             <w:r>
               <w:rPr>
@@ -8064,7 +7826,6 @@
                 <w:rFonts w:asciiTheme="minorHAnsi" w:eastAsiaTheme="minorEastAsia" w:hAnsiTheme="minorHAnsi" w:cstheme="minorBidi"/>
                 <w:color w:val="000000" w:themeColor="text1"/>
               </w:rPr>
-              <w:lastRenderedPageBreak/>
               <w:t xml:space="preserve">Establecí </w:t>
             </w:r>
             <w:r>
@@ -8072,15 +7833,7 @@
                 <w:rFonts w:asciiTheme="minorHAnsi" w:eastAsiaTheme="minorEastAsia" w:hAnsiTheme="minorHAnsi" w:cstheme="minorBidi"/>
                 <w:color w:val="000000" w:themeColor="text1"/>
               </w:rPr>
-              <w:t xml:space="preserve">un plan de trabajo que carece de </w:t>
-            </w:r>
-            <w:r>
-              <w:rPr>
-                <w:rFonts w:asciiTheme="minorHAnsi" w:eastAsiaTheme="minorEastAsia" w:hAnsiTheme="minorHAnsi" w:cstheme="minorBidi"/>
-                <w:color w:val="000000" w:themeColor="text1"/>
-              </w:rPr>
-              <w:lastRenderedPageBreak/>
-              <w:t xml:space="preserve">actividades necesarias para cumplir </w:t>
+              <w:t xml:space="preserve">un plan de trabajo que carece de actividades necesarias para cumplir </w:t>
             </w:r>
             <w:r>
               <w:rPr>
@@ -8116,7 +7869,6 @@
                 <w:rFonts w:asciiTheme="minorHAnsi" w:eastAsiaTheme="minorEastAsia" w:hAnsiTheme="minorHAnsi" w:cstheme="minorBidi"/>
                 <w:color w:val="000000" w:themeColor="text1"/>
               </w:rPr>
-              <w:lastRenderedPageBreak/>
               <w:t>No establec</w:t>
             </w:r>
             <w:r>
@@ -8131,15 +7883,7 @@
                 <w:rFonts w:asciiTheme="minorHAnsi" w:eastAsiaTheme="minorEastAsia" w:hAnsiTheme="minorHAnsi" w:cstheme="minorBidi"/>
                 <w:color w:val="000000" w:themeColor="text1"/>
               </w:rPr>
-              <w:t xml:space="preserve"> un plan de trabajo, o bien este </w:t>
-            </w:r>
-            <w:r>
-              <w:rPr>
-                <w:rFonts w:asciiTheme="minorHAnsi" w:eastAsiaTheme="minorEastAsia" w:hAnsiTheme="minorHAnsi" w:cstheme="minorBidi"/>
-                <w:color w:val="000000" w:themeColor="text1"/>
-              </w:rPr>
-              <w:lastRenderedPageBreak/>
-              <w:t xml:space="preserve">no </w:t>
+              <w:t xml:space="preserve"> un plan de trabajo, o bien este no </w:t>
             </w:r>
             <w:r>
               <w:rPr>
@@ -8195,7 +7939,6 @@
                 <w:color w:val="3B3838" w:themeColor="background2" w:themeShade="40"/>
                 <w:lang w:eastAsia="es-CL"/>
               </w:rPr>
-              <w:lastRenderedPageBreak/>
               <w:t>10</w:t>
             </w:r>
           </w:p>
@@ -8230,7 +7973,7 @@
         </w:tc>
         <w:tc>
           <w:tcPr>
-            <w:tcW w:w="2268" w:type="dxa"/>
+            <w:tcW w:w="2693" w:type="dxa"/>
             <w:shd w:val="clear" w:color="auto" w:fill="E7E6E6"/>
             <w:vAlign w:val="center"/>
           </w:tcPr>
@@ -8248,11 +7991,20 @@
                 <w:b/>
                 <w:color w:val="000000" w:themeColor="text1"/>
               </w:rPr>
-              <w:t>[X] Describ</w:t>
-            </w:r>
-            <w:r>
-              <w:rPr>
-                <w:rFonts w:asciiTheme="minorHAnsi" w:eastAsiaTheme="minorEastAsia" w:hAnsiTheme="minorHAnsi" w:cstheme="minorBidi"/>
+              <w:t xml:space="preserve">[X] </w:t>
+            </w:r>
+            <w:r>
+              <w:rPr>
+                <w:rFonts w:asciiTheme="minorHAnsi" w:eastAsiaTheme="minorEastAsia" w:hAnsiTheme="minorHAnsi" w:cstheme="minorBidi"/>
+                <w:b/>
+                <w:color w:val="000000" w:themeColor="text1"/>
+              </w:rPr>
+              <w:t>Describ</w:t>
+            </w:r>
+            <w:r>
+              <w:rPr>
+                <w:rFonts w:asciiTheme="minorHAnsi" w:eastAsiaTheme="minorEastAsia" w:hAnsiTheme="minorHAnsi" w:cstheme="minorBidi"/>
+                <w:b/>
                 <w:color w:val="000000" w:themeColor="text1"/>
               </w:rPr>
               <w:t>í</w:t>
@@ -8296,7 +8048,7 @@
         </w:tc>
         <w:tc>
           <w:tcPr>
-            <w:tcW w:w="2126" w:type="dxa"/>
+            <w:tcW w:w="1701" w:type="dxa"/>
             <w:vAlign w:val="center"/>
           </w:tcPr>
           <w:p>
@@ -8346,7 +8098,15 @@
                 <w:rFonts w:asciiTheme="minorHAnsi" w:eastAsiaTheme="minorEastAsia" w:hAnsiTheme="minorHAnsi" w:cstheme="minorBidi"/>
                 <w:color w:val="000000" w:themeColor="text1"/>
               </w:rPr>
-              <w:t xml:space="preserve"> con claridad su selección.</w:t>
+              <w:t xml:space="preserve"> con </w:t>
+            </w:r>
+            <w:r>
+              <w:rPr>
+                <w:rFonts w:asciiTheme="minorHAnsi" w:eastAsiaTheme="minorEastAsia" w:hAnsiTheme="minorHAnsi" w:cstheme="minorBidi"/>
+                <w:color w:val="000000" w:themeColor="text1"/>
+              </w:rPr>
+              <w:lastRenderedPageBreak/>
+              <w:t>claridad su selección.</w:t>
             </w:r>
           </w:p>
         </w:tc>
@@ -8368,6 +8128,7 @@
                 <w:rFonts w:asciiTheme="minorHAnsi" w:eastAsiaTheme="minorEastAsia" w:hAnsiTheme="minorHAnsi" w:cstheme="minorBidi"/>
                 <w:color w:val="000000" w:themeColor="text1"/>
               </w:rPr>
+              <w:lastRenderedPageBreak/>
               <w:t xml:space="preserve">Describí </w:t>
             </w:r>
             <w:r>
@@ -8522,7 +8283,7 @@
         </w:tc>
         <w:tc>
           <w:tcPr>
-            <w:tcW w:w="2268" w:type="dxa"/>
+            <w:tcW w:w="2693" w:type="dxa"/>
             <w:shd w:val="clear" w:color="auto" w:fill="E7E6E6" w:themeFill="background2"/>
             <w:vAlign w:val="center"/>
           </w:tcPr>
@@ -8599,7 +8360,7 @@
         </w:tc>
         <w:tc>
           <w:tcPr>
-            <w:tcW w:w="2126" w:type="dxa"/>
+            <w:tcW w:w="1701" w:type="dxa"/>
             <w:vAlign w:val="center"/>
           </w:tcPr>
           <w:p>
@@ -8723,7 +8484,7 @@
         </w:tc>
         <w:tc>
           <w:tcPr>
-            <w:tcW w:w="2268" w:type="dxa"/>
+            <w:tcW w:w="2693" w:type="dxa"/>
             <w:shd w:val="clear" w:color="auto" w:fill="E7E6E6"/>
             <w:vAlign w:val="center"/>
           </w:tcPr>
@@ -8747,7 +8508,7 @@
         </w:tc>
         <w:tc>
           <w:tcPr>
-            <w:tcW w:w="2126" w:type="dxa"/>
+            <w:tcW w:w="1701" w:type="dxa"/>
             <w:vAlign w:val="center"/>
           </w:tcPr>
           <w:p>
@@ -8887,31 +8648,13 @@
                 <w:color w:val="000000" w:themeColor="text1"/>
                 <w:lang w:eastAsia="es-CL"/>
               </w:rPr>
-              <w:t xml:space="preserve"> diseño del Proyecto APT </w:t>
-            </w:r>
-            <w:proofErr w:type="gramStart"/>
-            <w:r>
-              <w:rPr>
-                <w:rFonts w:asciiTheme="minorHAnsi" w:eastAsiaTheme="minorEastAsia" w:hAnsiTheme="minorHAnsi" w:cstheme="minorBidi"/>
-                <w:color w:val="000000" w:themeColor="text1"/>
-                <w:lang w:eastAsia="es-CL"/>
-              </w:rPr>
-              <w:t>de acuerdo a</w:t>
-            </w:r>
-            <w:proofErr w:type="gramEnd"/>
-            <w:r>
-              <w:rPr>
-                <w:rFonts w:asciiTheme="minorHAnsi" w:eastAsiaTheme="minorEastAsia" w:hAnsiTheme="minorHAnsi" w:cstheme="minorBidi"/>
-                <w:color w:val="000000" w:themeColor="text1"/>
-                <w:lang w:eastAsia="es-CL"/>
-              </w:rPr>
-              <w:t xml:space="preserve"> estándares definidos por la disciplina.</w:t>
-            </w:r>
-          </w:p>
-        </w:tc>
-        <w:tc>
-          <w:tcPr>
-            <w:tcW w:w="2268" w:type="dxa"/>
+              <w:t xml:space="preserve"> diseño del Proyecto APT de acuerdo a estándares definidos por la disciplina.</w:t>
+            </w:r>
+          </w:p>
+        </w:tc>
+        <w:tc>
+          <w:tcPr>
+            <w:tcW w:w="2693" w:type="dxa"/>
             <w:shd w:val="clear" w:color="auto" w:fill="E7E6E6" w:themeFill="background2"/>
             <w:vAlign w:val="center"/>
           </w:tcPr>
@@ -8946,7 +8689,7 @@
         </w:tc>
         <w:tc>
           <w:tcPr>
-            <w:tcW w:w="2126" w:type="dxa"/>
+            <w:tcW w:w="1701" w:type="dxa"/>
             <w:shd w:val="clear" w:color="auto" w:fill="FFFFFF" w:themeFill="background1"/>
             <w:vAlign w:val="center"/>
           </w:tcPr>
@@ -9078,59 +8821,58 @@
                 <w:color w:val="000000" w:themeColor="text1"/>
                 <w:lang w:eastAsia="es-CL"/>
               </w:rPr>
-              <w:t xml:space="preserve">12.  Redacta el </w:t>
-            </w:r>
-            <w:proofErr w:type="spellStart"/>
-            <w:proofErr w:type="gramStart"/>
-            <w:r>
-              <w:rPr>
-                <w:rFonts w:asciiTheme="minorHAnsi" w:eastAsiaTheme="minorEastAsia" w:hAnsiTheme="minorHAnsi" w:cstheme="minorBidi"/>
-                <w:color w:val="000000" w:themeColor="text1"/>
-                <w:lang w:eastAsia="es-CL"/>
-              </w:rPr>
-              <w:t>abstract</w:t>
-            </w:r>
-            <w:proofErr w:type="spellEnd"/>
-            <w:proofErr w:type="gramEnd"/>
-            <w:r>
-              <w:rPr>
-                <w:rFonts w:asciiTheme="minorHAnsi" w:eastAsiaTheme="minorEastAsia" w:hAnsiTheme="minorHAnsi" w:cstheme="minorBidi"/>
-                <w:color w:val="000000" w:themeColor="text1"/>
-                <w:lang w:eastAsia="es-CL"/>
-              </w:rPr>
-              <w:t xml:space="preserve">, las conclusiones y la reflexión en inglés con ideas completas que se conectan en secuencia lógica, </w:t>
-            </w:r>
-            <w:r>
-              <w:rPr>
-                <w:rFonts w:asciiTheme="minorHAnsi" w:eastAsiaTheme="minorEastAsia" w:hAnsiTheme="minorHAnsi" w:cstheme="minorBidi"/>
-                <w:color w:val="000000" w:themeColor="text1"/>
-                <w:lang w:eastAsia="es-CL"/>
+              <w:t>12.  Redacta el abstract, las conclusiones y la reflexión en inglés con ideas completas que se conectan en secuencia lógica, utilizando estructuras gramaticales y vocabulario en forma correcta y pertinente al tema a un nivel intermedio alto.</w:t>
+            </w:r>
+          </w:p>
+          <w:p>
+            <w:pPr>
+              <w:rPr>
+                <w:rFonts w:ascii="Calibri" w:eastAsia="Calibri" w:hAnsi="Calibri" w:cs="Calibri"/>
+                <w:color w:val="000000" w:themeColor="text1"/>
+              </w:rPr>
+            </w:pPr>
+          </w:p>
+          <w:p>
+            <w:pPr>
+              <w:rPr>
+                <w:rFonts w:ascii="Calibri" w:eastAsia="Calibri" w:hAnsi="Calibri" w:cs="Calibri"/>
+                <w:color w:val="000000" w:themeColor="text1"/>
+              </w:rPr>
+            </w:pPr>
+          </w:p>
+        </w:tc>
+        <w:tc>
+          <w:tcPr>
+            <w:tcW w:w="2693" w:type="dxa"/>
+            <w:shd w:val="clear" w:color="auto" w:fill="E7E6E6"/>
+            <w:vAlign w:val="center"/>
+          </w:tcPr>
+          <w:p>
+            <w:pPr>
+              <w:rPr>
+                <w:rFonts w:asciiTheme="minorHAnsi" w:eastAsia="Calibri" w:hAnsiTheme="minorHAnsi" w:cstheme="minorHAnsi"/>
+                <w:color w:val="000000" w:themeColor="text1"/>
+              </w:rPr>
+            </w:pPr>
+            <w:r>
+              <w:rPr>
+                <w:rFonts w:asciiTheme="minorHAnsi" w:hAnsiTheme="minorHAnsi" w:cstheme="minorHAnsi"/>
+                <w:b/>
               </w:rPr>
               <w:lastRenderedPageBreak/>
-              <w:t>utilizando estructuras gramaticales y vocabulario en forma correcta y pertinente al tema a un nivel intermedio alto.</w:t>
-            </w:r>
-          </w:p>
-          <w:p>
-            <w:pPr>
-              <w:rPr>
-                <w:rFonts w:ascii="Calibri" w:eastAsia="Calibri" w:hAnsi="Calibri" w:cs="Calibri"/>
-                <w:color w:val="000000" w:themeColor="text1"/>
-              </w:rPr>
-            </w:pPr>
-          </w:p>
-          <w:p>
-            <w:pPr>
-              <w:rPr>
-                <w:rFonts w:ascii="Calibri" w:eastAsia="Calibri" w:hAnsi="Calibri" w:cs="Calibri"/>
-                <w:color w:val="000000" w:themeColor="text1"/>
-              </w:rPr>
-            </w:pPr>
-          </w:p>
-        </w:tc>
-        <w:tc>
-          <w:tcPr>
-            <w:tcW w:w="2268" w:type="dxa"/>
-            <w:shd w:val="clear" w:color="auto" w:fill="E7E6E6"/>
+              <w:t xml:space="preserve">Redacta los textos en inglés siguiendo una secuencia lógica en la que todas las oraciones </w:t>
+            </w:r>
+            <w:r>
+              <w:rPr>
+                <w:rFonts w:asciiTheme="minorHAnsi" w:hAnsiTheme="minorHAnsi" w:cstheme="minorHAnsi"/>
+              </w:rPr>
+              <w:t>se conectan de manera fluida y comprensible,  utilizando en forma correcta las estructuras gramaticales y el vocabulario pertinentes al tema.</w:t>
+            </w:r>
+          </w:p>
+        </w:tc>
+        <w:tc>
+          <w:tcPr>
+            <w:tcW w:w="1701" w:type="dxa"/>
             <w:vAlign w:val="center"/>
           </w:tcPr>
           <w:p>
@@ -9142,74 +8884,53 @@
             </w:pPr>
             <w:r>
               <w:rPr>
+                <w:rFonts w:asciiTheme="minorHAnsi" w:eastAsiaTheme="minorEastAsia" w:hAnsiTheme="minorHAnsi" w:cstheme="minorBidi"/>
+                <w:b/>
+                <w:color w:val="000000" w:themeColor="text1"/>
+                <w:lang w:eastAsia="es-CL"/>
+              </w:rPr>
+              <w:t xml:space="preserve">[X] </w:t>
+            </w:r>
+            <w:r>
+              <w:rPr>
                 <w:rFonts w:asciiTheme="minorHAnsi" w:hAnsiTheme="minorHAnsi" w:cstheme="minorHAnsi"/>
-                <w:b/>
+              </w:rPr>
+              <w:t xml:space="preserve">Redacta los textos en inglés siguiendo una secuencia lógica en la que gran parte de las oraciones se conectan de manera fluida y </w:t>
+            </w:r>
+            <w:r>
+              <w:rPr>
+                <w:rFonts w:asciiTheme="minorHAnsi" w:hAnsiTheme="minorHAnsi" w:cstheme="minorHAnsi"/>
               </w:rPr>
               <w:lastRenderedPageBreak/>
-              <w:t xml:space="preserve">[X] Redacta los textos en inglés siguiendo una secuencia lógica en la que todas las oraciones </w:t>
-            </w:r>
+              <w:t>comprensible,  utilizando en forma correcta la mayoría de las estructuras gramaticales y el vocabulario pertinentes al tema.</w:t>
+            </w:r>
+          </w:p>
+        </w:tc>
+        <w:tc>
+          <w:tcPr>
+            <w:tcW w:w="2127" w:type="dxa"/>
+            <w:vAlign w:val="center"/>
+          </w:tcPr>
+          <w:p>
+            <w:pPr>
+              <w:rPr>
+                <w:rFonts w:asciiTheme="minorHAnsi" w:eastAsia="Calibri" w:hAnsiTheme="minorHAnsi" w:cstheme="minorHAnsi"/>
+                <w:color w:val="000000" w:themeColor="text1"/>
+              </w:rPr>
+            </w:pPr>
             <w:r>
               <w:rPr>
                 <w:rFonts w:asciiTheme="minorHAnsi" w:hAnsiTheme="minorHAnsi" w:cstheme="minorHAnsi"/>
               </w:rPr>
               <w:lastRenderedPageBreak/>
-              <w:t>se conectan de manera fluida y comprensible,  utilizando en forma correcta las estructuras gramaticales y el vocabulario pertinentes al tema.</w:t>
-            </w:r>
-          </w:p>
-        </w:tc>
-        <w:tc>
-          <w:tcPr>
-            <w:tcW w:w="2126" w:type="dxa"/>
-            <w:vAlign w:val="center"/>
-          </w:tcPr>
-          <w:p>
-            <w:pPr>
-              <w:rPr>
-                <w:rFonts w:asciiTheme="minorHAnsi" w:eastAsia="Calibri" w:hAnsiTheme="minorHAnsi" w:cstheme="minorHAnsi"/>
-                <w:color w:val="000000" w:themeColor="text1"/>
-              </w:rPr>
-            </w:pPr>
+              <w:t xml:space="preserve">Redacta los textos en inglés usando una secuencia limitada o desorganizada que dificulta la comprensión de las ideas,  utilizando inadecuadamente las estructuras </w:t>
+            </w:r>
             <w:r>
               <w:rPr>
                 <w:rFonts w:asciiTheme="minorHAnsi" w:hAnsiTheme="minorHAnsi" w:cstheme="minorHAnsi"/>
               </w:rPr>
               <w:lastRenderedPageBreak/>
-              <w:t xml:space="preserve">Redacta los textos en inglés siguiendo una secuencia lógica en la que gran parte de las </w:t>
-            </w:r>
-            <w:r>
-              <w:rPr>
-                <w:rFonts w:asciiTheme="minorHAnsi" w:hAnsiTheme="minorHAnsi" w:cstheme="minorHAnsi"/>
-              </w:rPr>
-              <w:lastRenderedPageBreak/>
-              <w:t>oraciones se conectan de manera fluida y comprensible,  utilizando en forma correcta la mayoría de las estructuras gramaticales y el vocabulario pertinentes al tema.</w:t>
-            </w:r>
-          </w:p>
-        </w:tc>
-        <w:tc>
-          <w:tcPr>
-            <w:tcW w:w="2127" w:type="dxa"/>
-            <w:vAlign w:val="center"/>
-          </w:tcPr>
-          <w:p>
-            <w:pPr>
-              <w:rPr>
-                <w:rFonts w:asciiTheme="minorHAnsi" w:eastAsia="Calibri" w:hAnsiTheme="minorHAnsi" w:cstheme="minorHAnsi"/>
-                <w:color w:val="000000" w:themeColor="text1"/>
-              </w:rPr>
-            </w:pPr>
-            <w:r>
-              <w:rPr>
-                <w:rFonts w:asciiTheme="minorHAnsi" w:hAnsiTheme="minorHAnsi" w:cstheme="minorHAnsi"/>
-              </w:rPr>
-              <w:lastRenderedPageBreak/>
-              <w:t xml:space="preserve">Redacta los textos en inglés usando una secuencia limitada o desorganizada que </w:t>
-            </w:r>
-            <w:r>
-              <w:rPr>
-                <w:rFonts w:asciiTheme="minorHAnsi" w:hAnsiTheme="minorHAnsi" w:cstheme="minorHAnsi"/>
-              </w:rPr>
-              <w:lastRenderedPageBreak/>
-              <w:t>dificulta la comprensión de las ideas,  utilizando inadecuadamente las estructuras gramaticales y el vocabulario pertinentes al tema.</w:t>
+              <w:t>gramaticales y el vocabulario pertinentes al tema.</w:t>
             </w:r>
           </w:p>
         </w:tc>
@@ -9242,27 +8963,21 @@
               <w:rPr>
                 <w:rFonts w:asciiTheme="minorHAnsi" w:hAnsiTheme="minorHAnsi" w:cstheme="minorHAnsi"/>
               </w:rPr>
-              <w:t xml:space="preserve">o escribe frases sueltas que no se </w:t>
-            </w:r>
+              <w:t xml:space="preserve">o escribe frases sueltas que no se relacionan entre ellas impidiendo la comprensión de las ideas, </w:t>
+            </w:r>
+          </w:p>
+          <w:p>
+            <w:pPr>
+              <w:rPr>
+                <w:rFonts w:asciiTheme="minorHAnsi" w:eastAsia="Calibri" w:hAnsiTheme="minorHAnsi" w:cstheme="minorHAnsi"/>
+                <w:color w:val="000000" w:themeColor="text1"/>
+              </w:rPr>
+            </w:pPr>
             <w:r>
               <w:rPr>
                 <w:rFonts w:asciiTheme="minorHAnsi" w:hAnsiTheme="minorHAnsi" w:cstheme="minorHAnsi"/>
               </w:rPr>
               <w:lastRenderedPageBreak/>
-              <w:t xml:space="preserve">relacionan entre ellas impidiendo la comprensión de las ideas, </w:t>
-            </w:r>
-          </w:p>
-          <w:p>
-            <w:pPr>
-              <w:rPr>
-                <w:rFonts w:asciiTheme="minorHAnsi" w:eastAsia="Calibri" w:hAnsiTheme="minorHAnsi" w:cstheme="minorHAnsi"/>
-                <w:color w:val="000000" w:themeColor="text1"/>
-              </w:rPr>
-            </w:pPr>
-            <w:r>
-              <w:rPr>
-                <w:rFonts w:asciiTheme="minorHAnsi" w:hAnsiTheme="minorHAnsi" w:cstheme="minorHAnsi"/>
-              </w:rPr>
               <w:t>utilizando estructuras gramaticales y vocabulario con errores graves.</w:t>
             </w:r>
           </w:p>
@@ -9371,73 +9086,10 @@
     </w:p>
     <w:p>
       <w:pPr>
-        <w:spacing w:before="200" w:after="80"/>
-      </w:pPr>
-      <w:r>
-        <w:rPr>
-          <w:rFonts w:ascii="Calibri" w:eastAsia="Calibri" w:hAnsi="Calibri"/>
-          <w:b/>
-          <w:color w:val="1C1C1C"/>
-          <w:sz w:val="22"/>
-        </w:rPr>
-        <w:t>Justificación de la autoevaluación</w:t>
-      </w:r>
-    </w:p>
-    <w:p>
-      <w:pPr>
         <w:spacing w:after="80"/>
         <w:ind w:left="283" w:hanging="227"/>
         <w:jc w:val="both"/>
       </w:pPr>
-      <w:r>
-        <w:rPr>
-          <w:rFonts w:ascii="Calibri" w:eastAsia="Calibri" w:hAnsi="Calibri"/>
-          <w:color w:val="1C1C1C"/>
-        </w:rPr>
-        <w:t>• Indicadores 1 a 8: la Guía 1.5 describe el proyecto y su relevancia, lo relaciona con las cuatro competencias del perfil de egreso indicando cómo se usa cada una, argumenta la factibilidad con tiempo, materiales y factores externos, y trae objetivos, metodología, plan de trabajo con recursos y obstaculizadores, y evidencias justificadas.</w:t>
-      </w:r>
-    </w:p>
-    <w:p>
-      <w:pPr>
-        <w:spacing w:after="80"/>
-        <w:ind w:left="283" w:hanging="227"/>
-        <w:jc w:val="both"/>
-      </w:pPr>
-      <w:r>
-        <w:rPr>
-          <w:rFonts w:ascii="Calibri" w:eastAsia="Calibri" w:hAnsi="Calibri"/>
-          <w:color w:val="1C1C1C"/>
-        </w:rPr>
-        <w:t>• Indicador 9 (Logrado): el documento fue revisado, pero al ser un informe extenso con citas normativas y técnicas no puedo asegurar cero errores de redacción o de formato de referencias.</w:t>
-      </w:r>
-    </w:p>
-    <w:p>
-      <w:pPr>
-        <w:spacing w:after="80"/>
-        <w:ind w:left="283" w:hanging="227"/>
-        <w:jc w:val="both"/>
-      </w:pPr>
-      <w:r>
-        <w:rPr>
-          <w:rFonts w:ascii="Calibri" w:eastAsia="Calibri" w:hAnsi="Calibri"/>
-          <w:color w:val="1C1C1C"/>
-        </w:rPr>
-        <w:t>• Indicador 11 (Logrado): los indicadores de calidad 3.2 (implementa modelos de datos) y 4.3 (implanta la solución) se evidencian recién en la Fase 2; en la Fase 1 están diseñados, no ejecutados.</w:t>
-      </w:r>
-    </w:p>
-    <w:p>
-      <w:pPr>
-        <w:spacing w:after="80"/>
-        <w:ind w:left="283" w:hanging="227"/>
-        <w:jc w:val="both"/>
-      </w:pPr>
-      <w:r>
-        <w:rPr>
-          <w:rFonts w:ascii="Calibri" w:eastAsia="Calibri" w:hAnsi="Calibri"/>
-          <w:color w:val="1C1C1C"/>
-        </w:rPr>
-        <w:t>• Indicador 12: el abstract, las conclusiones individuales y la reflexión se redactaron en inglés con secuencia lógica y vocabulario técnico.</w:t>
-      </w:r>
     </w:p>
     <w:sectPr>
       <w:headerReference w:type="default" r:id="rId12"/>
@@ -10020,7 +9672,7 @@
               <wp:lineTo x="7769" y="3221"/>
             </wp:wrapPolygon>
           </wp:wrapTight>
-          <wp:docPr id="4" name="Imagen 4"/>
+          <wp:docPr id="1454348582" name="Imagen 1454348582"/>
           <wp:cNvGraphicFramePr>
             <a:graphicFrameLocks xmlns:a="http://schemas.openxmlformats.org/drawingml/2006/main" noChangeAspect="1"/>
           </wp:cNvGraphicFramePr>

</xml_diff>